<commit_message>
Setup nen tang microservice (Sprint 0): common-lib, eureka, config, gateway, 4 service, docker-compose, pgAdmin, Swagger, tai lieu
</commit_message>
<xml_diff>
--- a/HIEN_TRANG_DU_AN.docx
+++ b/HIEN_TRANG_DU_AN.docx
@@ -1475,6 +1475,57 @@
     </w:tbl>
     <w:p>
       <w:pPr>
+        <w:spacing w:after="100"/>
+      </w:pPr>
+      <w:r>
+        <w:rPr>
+          <w:b/>
+          <w:bCs/>
+        </w:rPr>
+        <w:t xml:space="preserve">Khi chạy bằng Docker còn kèm các công cụ hạ tầng (không phải module để code):</w:t>
+      </w:r>
+    </w:p>
+    <w:p>
+      <w:pPr>
+        <w:pStyle w:val="ListParagraph"/>
+        <w:numPr>
+          <w:ilvl w:val="0"/>
+          <w:numId w:val="2"/>
+        </w:numPr>
+        <w:spacing w:after="40"/>
+      </w:pPr>
+      <w:r>
+        <w:t xml:space="preserve">PostgreSQL (cổng 5432) — cơ sở dữ liệu (chứa 3 DB riêng của các service)</w:t>
+      </w:r>
+    </w:p>
+    <w:p>
+      <w:pPr>
+        <w:pStyle w:val="ListParagraph"/>
+        <w:numPr>
+          <w:ilvl w:val="0"/>
+          <w:numId w:val="2"/>
+        </w:numPr>
+        <w:spacing w:after="40"/>
+      </w:pPr>
+      <w:r>
+        <w:t xml:space="preserve">MinIO (cổng 9000 API / 9001 console) — lưu file ảnh/video</w:t>
+      </w:r>
+    </w:p>
+    <w:p>
+      <w:pPr>
+        <w:pStyle w:val="ListParagraph"/>
+        <w:numPr>
+          <w:ilvl w:val="0"/>
+          <w:numId w:val="2"/>
+        </w:numPr>
+        <w:spacing w:after="40"/>
+      </w:pPr>
+      <w:r>
+        <w:t xml:space="preserve">pgAdmin (cổng 5051) — giao diện web xem &amp; quản lý PostgreSQL; đã cấu hình sẵn kết nối tới DB, đăng nhập admin@vsl.com / admin, mật khẩu DB là vsl</w:t>
+      </w:r>
+    </w:p>
+    <w:p>
+      <w:pPr>
         <w:pStyle w:val="Heading1"/>
         <w:spacing w:after="140" w:before="300"/>
       </w:pPr>
@@ -1717,6 +1768,20 @@
           <w:szCs w:val="18"/>
         </w:rPr>
         <w:t xml:space="preserve">   postgres :5432 (nhieu DB)  |  minio :9000/9001 (luu file)</w:t>
+      </w:r>
+    </w:p>
+    <w:p>
+      <w:pPr>
+        <w:shd w:fill="F2F2F2" w:color="auto" w:val="clear"/>
+        <w:spacing w:after="0"/>
+      </w:pPr>
+      <w:r>
+        <w:rPr>
+          <w:rFonts w:ascii="Consolas" w:cs="Consolas" w:eastAsia="Consolas" w:hAnsi="Consolas"/>
+          <w:sz w:val="18"/>
+          <w:szCs w:val="18"/>
+        </w:rPr>
+        <w:t xml:space="preserve">   pgadmin :5051 (xem/quan ly DB qua web)</w:t>
       </w:r>
     </w:p>
     <w:p>

</xml_diff>